<commit_message>
chore: remove temporary word lock file
</commit_message>
<xml_diff>
--- a/reports/Data_Understanding_Report.docx
+++ b/reports/Data_Understanding_Report.docx
@@ -2,6 +2,1172 @@
 <file path=word/document.xml><?xml version="1.0" encoding="utf-8"?>
 <w:document xmlns:wpc="http://schemas.microsoft.com/office/word/2010/wordprocessingCanvas" xmlns:cx="http://schemas.microsoft.com/office/drawing/2014/chartex" xmlns:cx1="http://schemas.microsoft.com/office/drawing/2015/9/8/chartex" xmlns:cx2="http://schemas.microsoft.com/office/drawing/2015/10/21/chartex" xmlns:cx3="http://schemas.microsoft.com/office/drawing/2016/5/9/chartex" xmlns:cx4="http://schemas.microsoft.com/office/drawing/2016/5/10/chartex" xmlns:cx5="http://schemas.microsoft.com/office/drawing/2016/5/11/chartex" xmlns:cx6="http://schemas.microsoft.com/office/drawing/2016/5/12/chartex" xmlns:cx7="http://schemas.microsoft.com/office/drawing/2016/5/13/chartex" xmlns:cx8="http://schemas.microsoft.com/office/drawing/2016/5/14/chartex" xmlns:mc="http://schemas.openxmlformats.org/markup-compatibility/2006" xmlns:aink="http://schemas.microsoft.com/office/drawing/2016/ink" xmlns:am3d="http://schemas.microsoft.com/office/drawing/2017/model3d" xmlns:o="urn:schemas-microsoft-com:office:office" xmlns:oel="http://schemas.microsoft.com/office/2019/extlst" xmlns:r="http://schemas.openxmlformats.org/officeDocument/2006/relationships" xmlns:m="http://schemas.openxmlformats.org/officeDocument/2006/math" xmlns:v="urn:schemas-microsoft-com:vml" xmlns:wp14="http://schemas.microsoft.com/office/word/2010/wordprocessingDrawing" xmlns:wp="http://schemas.openxmlformats.org/drawingml/2006/wordprocessingDrawing" xmlns:w10="urn:schemas-microsoft-com:office:word" xmlns:w="http://schemas.openxmlformats.org/wordprocessingml/2006/main" xmlns:w14="http://schemas.microsoft.com/office/word/2010/wordml" xmlns:w15="http://schemas.microsoft.com/office/word/2012/wordml" xmlns:w16cex="http://schemas.microsoft.com/office/word/2018/wordml/cex" xmlns:w16cid="http://schemas.microsoft.com/office/word/2016/wordml/cid" xmlns:w16="http://schemas.microsoft.com/office/word/2018/wordml" xmlns:w16du="http://schemas.microsoft.com/office/word/2023/wordml/word16du" xmlns:w16sdtdh="http://schemas.microsoft.com/office/word/2020/wordml/sdtdatahash" xmlns:w16sdtfl="http://schemas.microsoft.com/office/word/2024/wordml/sdtformatlock" xmlns:w16se="http://schemas.microsoft.com/office/word/2015/wordml/symex" xmlns:wpg="http://schemas.microsoft.com/office/word/2010/wordprocessingGroup" xmlns:wpi="http://schemas.microsoft.com/office/word/2010/wordprocessingInk" xmlns:wne="http://schemas.microsoft.com/office/word/2006/wordml" xmlns:wps="http://schemas.microsoft.com/office/word/2010/wordprocessingShape" mc:Ignorable="w14 w15 w16se w16cid w16 w16cex w16sdtdh w16sdtfl w16du wp14">
   <w:body>
+    <w:p>
+      <w:pPr>
+        <w:pStyle w:val="Heading1"/>
+        <w:rPr>
+          <w:color w:val="EE0000"/>
+          <w:sz w:val="36"/>
+          <w:szCs w:val="36"/>
+        </w:rPr>
+      </w:pPr>
+      <w:r>
+        <w:rPr>
+          <w:color w:val="EE0000"/>
+          <w:sz w:val="36"/>
+          <w:szCs w:val="36"/>
+        </w:rPr>
+        <w:t xml:space="preserve">Next processes </w:t>
+      </w:r>
+      <w:proofErr w:type="gramStart"/>
+      <w:r>
+        <w:rPr>
+          <w:color w:val="EE0000"/>
+          <w:sz w:val="36"/>
+          <w:szCs w:val="36"/>
+        </w:rPr>
+        <w:t>today:-</w:t>
+      </w:r>
+      <w:proofErr w:type="gramEnd"/>
+    </w:p>
+    <w:p>
+      <w:pPr>
+        <w:pStyle w:val="Heading1"/>
+        <w:rPr>
+          <w:sz w:val="36"/>
+          <w:szCs w:val="36"/>
+        </w:rPr>
+      </w:pPr>
+      <w:r>
+        <w:rPr>
+          <w:sz w:val="36"/>
+          <w:szCs w:val="36"/>
+        </w:rPr>
+        <w:t>Dataset Selection</w:t>
+      </w:r>
+    </w:p>
+    <w:p>
+      <w:pPr>
+        <w:pStyle w:val="Heading2"/>
+      </w:pPr>
+      <w:r>
+        <w:t>Recommended Dataset</w:t>
+      </w:r>
+    </w:p>
+    <w:p>
+      <w:pPr>
+        <w:pStyle w:val="FirstParagraph"/>
+      </w:pPr>
+      <w:r>
+        <w:t>Telco Customer Churn Dataset</w:t>
+      </w:r>
+    </w:p>
+    <w:p>
+      <w:pPr>
+        <w:pStyle w:val="Heading3"/>
+      </w:pPr>
+      <w:bookmarkStart w:id="0" w:name="dataset-characteristics"/>
+      <w:r>
+        <w:t>Dataset Characteristics</w:t>
+      </w:r>
+    </w:p>
+    <w:p>
+      <w:pPr>
+        <w:pStyle w:val="Compact"/>
+        <w:numPr>
+          <w:ilvl w:val="0"/>
+          <w:numId w:val="1"/>
+        </w:numPr>
+      </w:pPr>
+      <w:r>
+        <w:t>Binary Classification Problem</w:t>
+      </w:r>
+    </w:p>
+    <w:p>
+      <w:pPr>
+        <w:pStyle w:val="Compact"/>
+        <w:numPr>
+          <w:ilvl w:val="0"/>
+          <w:numId w:val="1"/>
+        </w:numPr>
+      </w:pPr>
+      <w:r>
+        <w:t>Real-world business use case</w:t>
+      </w:r>
+    </w:p>
+    <w:p>
+      <w:pPr>
+        <w:pStyle w:val="Compact"/>
+        <w:numPr>
+          <w:ilvl w:val="0"/>
+          <w:numId w:val="1"/>
+        </w:numPr>
+      </w:pPr>
+      <w:r>
+        <w:t>Numerical and categorical features</w:t>
+      </w:r>
+    </w:p>
+    <w:p>
+      <w:pPr>
+        <w:pStyle w:val="Compact"/>
+        <w:numPr>
+          <w:ilvl w:val="0"/>
+          <w:numId w:val="1"/>
+        </w:numPr>
+      </w:pPr>
+      <w:r>
+        <w:t>Missing value handling opportunities</w:t>
+      </w:r>
+    </w:p>
+    <w:p>
+      <w:pPr>
+        <w:pStyle w:val="Compact"/>
+        <w:numPr>
+          <w:ilvl w:val="0"/>
+          <w:numId w:val="1"/>
+        </w:numPr>
+      </w:pPr>
+      <w:r>
+        <w:t>Feature engineering opportunities</w:t>
+      </w:r>
+    </w:p>
+    <w:p>
+      <w:pPr>
+        <w:pStyle w:val="Compact"/>
+        <w:numPr>
+          <w:ilvl w:val="0"/>
+          <w:numId w:val="1"/>
+        </w:numPr>
+      </w:pPr>
+      <w:r>
+        <w:t>Suitable for beginner to intermediate machine learning projects</w:t>
+      </w:r>
+    </w:p>
+    <w:bookmarkEnd w:id="0"/>
+    <w:p>
+      <w:pPr>
+        <w:pStyle w:val="Heading3"/>
+      </w:pPr>
+      <w:r>
+        <w:t>Target Variable</w:t>
+      </w:r>
+    </w:p>
+    <w:p>
+      <w:pPr>
+        <w:pStyle w:val="FirstParagraph"/>
+      </w:pPr>
+      <w:r>
+        <w:t>Churn</w:t>
+      </w:r>
+    </w:p>
+    <w:p>
+      <w:pPr>
+        <w:pStyle w:val="BodyText"/>
+      </w:pPr>
+      <w:r>
+        <w:t>Values:</w:t>
+      </w:r>
+    </w:p>
+    <w:p>
+      <w:pPr>
+        <w:pStyle w:val="Compact"/>
+        <w:numPr>
+          <w:ilvl w:val="0"/>
+          <w:numId w:val="1"/>
+        </w:numPr>
+      </w:pPr>
+      <w:r>
+        <w:t>Yes = Customer left the service</w:t>
+      </w:r>
+    </w:p>
+    <w:p>
+      <w:pPr>
+        <w:pStyle w:val="Compact"/>
+        <w:numPr>
+          <w:ilvl w:val="0"/>
+          <w:numId w:val="1"/>
+        </w:numPr>
+      </w:pPr>
+      <w:r>
+        <w:t>No = Customer stayed</w:t>
+      </w:r>
+    </w:p>
+    <w:p>
+      <w:pPr>
+        <w:pStyle w:val="Heading2"/>
+      </w:pPr>
+      <w:r>
+        <w:t>Data Collection and Understanding</w:t>
+      </w:r>
+    </w:p>
+    <w:p>
+      <w:pPr>
+        <w:pStyle w:val="Heading3"/>
+      </w:pPr>
+      <w:bookmarkStart w:id="1" w:name="activities"/>
+      <w:r>
+        <w:t>Activities</w:t>
+      </w:r>
+    </w:p>
+    <w:p>
+      <w:pPr>
+        <w:pStyle w:val="Compact"/>
+        <w:ind w:left="720"/>
+      </w:pPr>
+    </w:p>
+    <w:p>
+      <w:pPr>
+        <w:pStyle w:val="Compact"/>
+        <w:ind w:left="720"/>
+      </w:pPr>
+    </w:p>
+    <w:p>
+      <w:pPr>
+        <w:pStyle w:val="Compact"/>
+        <w:ind w:left="720"/>
+      </w:pPr>
+    </w:p>
+    <w:p>
+      <w:pPr>
+        <w:pStyle w:val="Compact"/>
+        <w:ind w:left="720"/>
+      </w:pPr>
+    </w:p>
+    <w:p>
+      <w:pPr>
+        <w:pStyle w:val="Compact"/>
+        <w:ind w:left="720"/>
+      </w:pPr>
+    </w:p>
+    <w:p>
+      <w:pPr>
+        <w:pStyle w:val="Compact"/>
+        <w:ind w:left="720"/>
+      </w:pPr>
+    </w:p>
+    <w:p>
+      <w:pPr>
+        <w:pStyle w:val="Compact"/>
+        <w:ind w:left="720"/>
+      </w:pPr>
+    </w:p>
+    <w:p>
+      <w:pPr>
+        <w:pStyle w:val="Compact"/>
+        <w:ind w:left="720"/>
+      </w:pPr>
+    </w:p>
+    <w:p>
+      <w:pPr>
+        <w:pStyle w:val="Compact"/>
+        <w:ind w:left="720"/>
+      </w:pPr>
+    </w:p>
+    <w:p>
+      <w:pPr>
+        <w:pStyle w:val="Compact"/>
+        <w:ind w:left="720"/>
+      </w:pPr>
+    </w:p>
+    <w:p>
+      <w:pPr>
+        <w:pStyle w:val="Compact"/>
+        <w:ind w:left="720"/>
+      </w:pPr>
+    </w:p>
+    <w:p>
+      <w:pPr>
+        <w:pStyle w:val="Compact"/>
+        <w:ind w:left="720"/>
+      </w:pPr>
+    </w:p>
+    <w:p>
+      <w:pPr>
+        <w:pStyle w:val="Compact"/>
+        <w:ind w:left="720"/>
+      </w:pPr>
+    </w:p>
+    <w:p>
+      <w:pPr>
+        <w:pStyle w:val="Compact"/>
+        <w:ind w:left="720"/>
+      </w:pPr>
+    </w:p>
+    <w:p>
+      <w:pPr>
+        <w:pStyle w:val="Compact"/>
+        <w:numPr>
+          <w:ilvl w:val="0"/>
+          <w:numId w:val="2"/>
+        </w:numPr>
+      </w:pPr>
+      <w:r>
+        <w:lastRenderedPageBreak/>
+        <w:t>Load dataset.</w:t>
+      </w:r>
+    </w:p>
+    <w:p>
+      <w:pPr>
+        <w:pStyle w:val="Compact"/>
+        <w:ind w:left="720"/>
+      </w:pPr>
+    </w:p>
+    <w:p>
+      <w:pPr>
+        <w:pStyle w:val="Compact"/>
+      </w:pPr>
+      <w:r>
+        <w:drawing>
+          <wp:inline distT="0" distB="0" distL="0" distR="0" wp14:anchorId="74C1F71B" wp14:editId="1163BD0B">
+            <wp:extent cx="4158705" cy="5242560"/>
+            <wp:effectExtent l="0" t="0" r="0" b="0"/>
+            <wp:docPr id="434358768" name="Picture 1"/>
+            <wp:cNvGraphicFramePr>
+              <a:graphicFrameLocks xmlns:a="http://schemas.openxmlformats.org/drawingml/2006/main" noChangeAspect="1"/>
+            </wp:cNvGraphicFramePr>
+            <a:graphic xmlns:a="http://schemas.openxmlformats.org/drawingml/2006/main">
+              <a:graphicData uri="http://schemas.openxmlformats.org/drawingml/2006/picture">
+                <pic:pic xmlns:pic="http://schemas.openxmlformats.org/drawingml/2006/picture">
+                  <pic:nvPicPr>
+                    <pic:cNvPr id="434358768" name=""/>
+                    <pic:cNvPicPr/>
+                  </pic:nvPicPr>
+                  <pic:blipFill>
+                    <a:blip r:embed="rId5"/>
+                    <a:stretch>
+                      <a:fillRect/>
+                    </a:stretch>
+                  </pic:blipFill>
+                  <pic:spPr>
+                    <a:xfrm>
+                      <a:off x="0" y="0"/>
+                      <a:ext cx="4161678" cy="5246308"/>
+                    </a:xfrm>
+                    <a:prstGeom prst="rect">
+                      <a:avLst/>
+                    </a:prstGeom>
+                  </pic:spPr>
+                </pic:pic>
+              </a:graphicData>
+            </a:graphic>
+          </wp:inline>
+        </w:drawing>
+      </w:r>
+    </w:p>
+    <w:p>
+      <w:pPr>
+        <w:pStyle w:val="Compact"/>
+      </w:pPr>
+    </w:p>
+    <w:p>
+      <w:pPr>
+        <w:pStyle w:val="Compact"/>
+      </w:pPr>
+      <w:r>
+        <w:drawing>
+          <wp:inline distT="0" distB="0" distL="0" distR="0" wp14:anchorId="1E124591" wp14:editId="32A67A77">
+            <wp:extent cx="6046226" cy="2476500"/>
+            <wp:effectExtent l="0" t="0" r="0" b="0"/>
+            <wp:docPr id="1561559014" name="Picture 1"/>
+            <wp:cNvGraphicFramePr>
+              <a:graphicFrameLocks xmlns:a="http://schemas.openxmlformats.org/drawingml/2006/main" noChangeAspect="1"/>
+            </wp:cNvGraphicFramePr>
+            <a:graphic xmlns:a="http://schemas.openxmlformats.org/drawingml/2006/main">
+              <a:graphicData uri="http://schemas.openxmlformats.org/drawingml/2006/picture">
+                <pic:pic xmlns:pic="http://schemas.openxmlformats.org/drawingml/2006/picture">
+                  <pic:nvPicPr>
+                    <pic:cNvPr id="1561559014" name=""/>
+                    <pic:cNvPicPr/>
+                  </pic:nvPicPr>
+                  <pic:blipFill>
+                    <a:blip r:embed="rId6"/>
+                    <a:stretch>
+                      <a:fillRect/>
+                    </a:stretch>
+                  </pic:blipFill>
+                  <pic:spPr>
+                    <a:xfrm>
+                      <a:off x="0" y="0"/>
+                      <a:ext cx="6066970" cy="2484997"/>
+                    </a:xfrm>
+                    <a:prstGeom prst="rect">
+                      <a:avLst/>
+                    </a:prstGeom>
+                  </pic:spPr>
+                </pic:pic>
+              </a:graphicData>
+            </a:graphic>
+          </wp:inline>
+        </w:drawing>
+      </w:r>
+    </w:p>
+    <w:p>
+      <w:pPr>
+        <w:pStyle w:val="Compact"/>
+      </w:pPr>
+    </w:p>
+    <w:p>
+      <w:pPr>
+        <w:pStyle w:val="Compact"/>
+      </w:pPr>
+    </w:p>
+    <w:p>
+      <w:pPr>
+        <w:pStyle w:val="Compact"/>
+        <w:numPr>
+          <w:ilvl w:val="0"/>
+          <w:numId w:val="4"/>
+        </w:numPr>
+      </w:pPr>
+      <w:r>
+        <w:lastRenderedPageBreak/>
+        <w:t>Review dataset structure</w:t>
+      </w:r>
+      <w:r>
+        <w:t xml:space="preserve"> and 6. </w:t>
+      </w:r>
+      <w:r>
+        <w:t>Analyze data types.</w:t>
+      </w:r>
+    </w:p>
+    <w:p>
+      <w:pPr>
+        <w:pStyle w:val="Compact"/>
+      </w:pPr>
+    </w:p>
+    <w:p>
+      <w:pPr>
+        <w:pStyle w:val="Compact"/>
+      </w:pPr>
+      <w:r>
+        <w:drawing>
+          <wp:inline distT="0" distB="0" distL="0" distR="0" wp14:anchorId="55282C89" wp14:editId="7B7075CA">
+            <wp:extent cx="3456285" cy="4312920"/>
+            <wp:effectExtent l="0" t="0" r="0" b="0"/>
+            <wp:docPr id="691638667" name="Picture 1"/>
+            <wp:cNvGraphicFramePr>
+              <a:graphicFrameLocks xmlns:a="http://schemas.openxmlformats.org/drawingml/2006/main" noChangeAspect="1"/>
+            </wp:cNvGraphicFramePr>
+            <a:graphic xmlns:a="http://schemas.openxmlformats.org/drawingml/2006/main">
+              <a:graphicData uri="http://schemas.openxmlformats.org/drawingml/2006/picture">
+                <pic:pic xmlns:pic="http://schemas.openxmlformats.org/drawingml/2006/picture">
+                  <pic:nvPicPr>
+                    <pic:cNvPr id="691638667" name=""/>
+                    <pic:cNvPicPr/>
+                  </pic:nvPicPr>
+                  <pic:blipFill>
+                    <a:blip r:embed="rId7"/>
+                    <a:stretch>
+                      <a:fillRect/>
+                    </a:stretch>
+                  </pic:blipFill>
+                  <pic:spPr>
+                    <a:xfrm>
+                      <a:off x="0" y="0"/>
+                      <a:ext cx="3459346" cy="4316739"/>
+                    </a:xfrm>
+                    <a:prstGeom prst="rect">
+                      <a:avLst/>
+                    </a:prstGeom>
+                  </pic:spPr>
+                </pic:pic>
+              </a:graphicData>
+            </a:graphic>
+          </wp:inline>
+        </w:drawing>
+      </w:r>
+    </w:p>
+    <w:p>
+      <w:pPr>
+        <w:pStyle w:val="Compact"/>
+      </w:pPr>
+    </w:p>
+    <w:p>
+      <w:pPr>
+        <w:pStyle w:val="Compact"/>
+        <w:numPr>
+          <w:ilvl w:val="0"/>
+          <w:numId w:val="4"/>
+        </w:numPr>
+      </w:pPr>
+      <w:r>
+        <w:t>Understand feature definitions.</w:t>
+      </w:r>
+    </w:p>
+    <w:p>
+      <w:pPr>
+        <w:pStyle w:val="Compact"/>
+      </w:pPr>
+    </w:p>
+    <w:p>
+      <w:pPr>
+        <w:pStyle w:val="Compact"/>
+      </w:pPr>
+      <w:r>
+        <w:drawing>
+          <wp:inline distT="0" distB="0" distL="0" distR="0" wp14:anchorId="35EE7663" wp14:editId="630514DA">
+            <wp:extent cx="5666525" cy="3322320"/>
+            <wp:effectExtent l="0" t="0" r="0" b="0"/>
+            <wp:docPr id="1763012835" name="Picture 1"/>
+            <wp:cNvGraphicFramePr>
+              <a:graphicFrameLocks xmlns:a="http://schemas.openxmlformats.org/drawingml/2006/main" noChangeAspect="1"/>
+            </wp:cNvGraphicFramePr>
+            <a:graphic xmlns:a="http://schemas.openxmlformats.org/drawingml/2006/main">
+              <a:graphicData uri="http://schemas.openxmlformats.org/drawingml/2006/picture">
+                <pic:pic xmlns:pic="http://schemas.openxmlformats.org/drawingml/2006/picture">
+                  <pic:nvPicPr>
+                    <pic:cNvPr id="1763012835" name=""/>
+                    <pic:cNvPicPr/>
+                  </pic:nvPicPr>
+                  <pic:blipFill>
+                    <a:blip r:embed="rId8"/>
+                    <a:stretch>
+                      <a:fillRect/>
+                    </a:stretch>
+                  </pic:blipFill>
+                  <pic:spPr>
+                    <a:xfrm>
+                      <a:off x="0" y="0"/>
+                      <a:ext cx="5689696" cy="3335905"/>
+                    </a:xfrm>
+                    <a:prstGeom prst="rect">
+                      <a:avLst/>
+                    </a:prstGeom>
+                  </pic:spPr>
+                </pic:pic>
+              </a:graphicData>
+            </a:graphic>
+          </wp:inline>
+        </w:drawing>
+      </w:r>
+    </w:p>
+    <w:p>
+      <w:pPr>
+        <w:pStyle w:val="Compact"/>
+        <w:numPr>
+          <w:ilvl w:val="0"/>
+          <w:numId w:val="4"/>
+        </w:numPr>
+      </w:pPr>
+      <w:r>
+        <w:lastRenderedPageBreak/>
+        <w:t>Identify target variable.</w:t>
+      </w:r>
+    </w:p>
+    <w:p>
+      <w:pPr>
+        <w:pStyle w:val="Compact"/>
+      </w:pPr>
+    </w:p>
+    <w:p>
+      <w:pPr>
+        <w:pStyle w:val="Compact"/>
+      </w:pPr>
+      <w:r>
+        <w:drawing>
+          <wp:inline distT="0" distB="0" distL="0" distR="0" wp14:anchorId="69D52947" wp14:editId="319D706C">
+            <wp:extent cx="4389500" cy="3063505"/>
+            <wp:effectExtent l="0" t="0" r="0" b="3810"/>
+            <wp:docPr id="1223853015" name="Picture 1"/>
+            <wp:cNvGraphicFramePr>
+              <a:graphicFrameLocks xmlns:a="http://schemas.openxmlformats.org/drawingml/2006/main" noChangeAspect="1"/>
+            </wp:cNvGraphicFramePr>
+            <a:graphic xmlns:a="http://schemas.openxmlformats.org/drawingml/2006/main">
+              <a:graphicData uri="http://schemas.openxmlformats.org/drawingml/2006/picture">
+                <pic:pic xmlns:pic="http://schemas.openxmlformats.org/drawingml/2006/picture">
+                  <pic:nvPicPr>
+                    <pic:cNvPr id="1223853015" name=""/>
+                    <pic:cNvPicPr/>
+                  </pic:nvPicPr>
+                  <pic:blipFill>
+                    <a:blip r:embed="rId9"/>
+                    <a:stretch>
+                      <a:fillRect/>
+                    </a:stretch>
+                  </pic:blipFill>
+                  <pic:spPr>
+                    <a:xfrm>
+                      <a:off x="0" y="0"/>
+                      <a:ext cx="4389500" cy="3063505"/>
+                    </a:xfrm>
+                    <a:prstGeom prst="rect">
+                      <a:avLst/>
+                    </a:prstGeom>
+                  </pic:spPr>
+                </pic:pic>
+              </a:graphicData>
+            </a:graphic>
+          </wp:inline>
+        </w:drawing>
+      </w:r>
+    </w:p>
+    <w:p>
+      <w:pPr>
+        <w:pStyle w:val="Compact"/>
+        <w:numPr>
+          <w:ilvl w:val="0"/>
+          <w:numId w:val="4"/>
+        </w:numPr>
+      </w:pPr>
+      <w:r>
+        <w:t>Detect missing values.</w:t>
+      </w:r>
+    </w:p>
+    <w:p>
+      <w:pPr>
+        <w:pStyle w:val="Compact"/>
+      </w:pPr>
+    </w:p>
+    <w:p>
+      <w:pPr>
+        <w:pStyle w:val="Compact"/>
+      </w:pPr>
+      <w:r>
+        <w:drawing>
+          <wp:inline distT="0" distB="0" distL="0" distR="0" wp14:anchorId="37116FEB" wp14:editId="32FF6410">
+            <wp:extent cx="4656223" cy="4511431"/>
+            <wp:effectExtent l="0" t="0" r="0" b="3810"/>
+            <wp:docPr id="411304605" name="Picture 1"/>
+            <wp:cNvGraphicFramePr>
+              <a:graphicFrameLocks xmlns:a="http://schemas.openxmlformats.org/drawingml/2006/main" noChangeAspect="1"/>
+            </wp:cNvGraphicFramePr>
+            <a:graphic xmlns:a="http://schemas.openxmlformats.org/drawingml/2006/main">
+              <a:graphicData uri="http://schemas.openxmlformats.org/drawingml/2006/picture">
+                <pic:pic xmlns:pic="http://schemas.openxmlformats.org/drawingml/2006/picture">
+                  <pic:nvPicPr>
+                    <pic:cNvPr id="411304605" name=""/>
+                    <pic:cNvPicPr/>
+                  </pic:nvPicPr>
+                  <pic:blipFill>
+                    <a:blip r:embed="rId10"/>
+                    <a:stretch>
+                      <a:fillRect/>
+                    </a:stretch>
+                  </pic:blipFill>
+                  <pic:spPr>
+                    <a:xfrm>
+                      <a:off x="0" y="0"/>
+                      <a:ext cx="4656223" cy="4511431"/>
+                    </a:xfrm>
+                    <a:prstGeom prst="rect">
+                      <a:avLst/>
+                    </a:prstGeom>
+                  </pic:spPr>
+                </pic:pic>
+              </a:graphicData>
+            </a:graphic>
+          </wp:inline>
+        </w:drawing>
+      </w:r>
+    </w:p>
+    <w:p>
+      <w:pPr>
+        <w:pStyle w:val="Compact"/>
+      </w:pPr>
+    </w:p>
+    <w:p>
+      <w:pPr>
+        <w:pStyle w:val="Compact"/>
+      </w:pPr>
+    </w:p>
+    <w:p>
+      <w:pPr>
+        <w:pStyle w:val="Compact"/>
+      </w:pPr>
+    </w:p>
+    <w:p>
+      <w:pPr>
+        <w:pStyle w:val="Compact"/>
+      </w:pPr>
+    </w:p>
+    <w:p>
+      <w:pPr>
+        <w:pStyle w:val="Heading3"/>
+      </w:pPr>
+      <w:bookmarkStart w:id="2" w:name="deliverables-1"/>
+      <w:bookmarkEnd w:id="1"/>
+      <w:r>
+        <w:t>Deliverables</w:t>
+      </w:r>
+    </w:p>
+    <w:p>
+      <w:pPr>
+        <w:pStyle w:val="Compact"/>
+        <w:numPr>
+          <w:ilvl w:val="0"/>
+          <w:numId w:val="1"/>
+        </w:numPr>
+      </w:pPr>
+      <w:r>
+        <w:t>Data Dictionary</w:t>
+      </w:r>
+    </w:p>
+    <w:p>
+      <w:pPr>
+        <w:pStyle w:val="Compact"/>
+        <w:numPr>
+          <w:ilvl w:val="0"/>
+          <w:numId w:val="1"/>
+        </w:numPr>
+      </w:pPr>
+      <w:r>
+        <w:t>Dataset Summary Report</w:t>
+      </w:r>
+    </w:p>
+    <w:p>
+      <w:pPr>
+        <w:pStyle w:val="FirstParagraph"/>
+      </w:pPr>
+      <w:r>
+        <w:t>Example Features:</w:t>
+      </w:r>
+    </w:p>
+    <w:tbl>
+      <w:tblPr>
+        <w:tblStyle w:val="TableGrid"/>
+        <w:tblW w:w="0" w:type="auto"/>
+        <w:tblLook w:val="0020" w:firstRow="1" w:lastRow="0" w:firstColumn="0" w:lastColumn="0" w:noHBand="0" w:noVBand="0"/>
+      </w:tblPr>
+      <w:tblGrid>
+        <w:gridCol w:w="1917"/>
+        <w:gridCol w:w="3693"/>
+      </w:tblGrid>
+      <w:tr>
+        <w:tc>
+          <w:tcPr>
+            <w:tcW w:w="0" w:type="auto"/>
+          </w:tcPr>
+          <w:p>
+            <w:pPr>
+              <w:pStyle w:val="Compact"/>
+              <w:rPr>
+                <w:b/>
+                <w:bCs/>
+              </w:rPr>
+            </w:pPr>
+            <w:r>
+              <w:rPr>
+                <w:b/>
+                <w:bCs/>
+              </w:rPr>
+              <w:t>Feature</w:t>
+            </w:r>
+          </w:p>
+        </w:tc>
+        <w:tc>
+          <w:tcPr>
+            <w:tcW w:w="0" w:type="auto"/>
+          </w:tcPr>
+          <w:p>
+            <w:pPr>
+              <w:pStyle w:val="Compact"/>
+              <w:rPr>
+                <w:b/>
+                <w:bCs/>
+              </w:rPr>
+            </w:pPr>
+            <w:r>
+              <w:rPr>
+                <w:b/>
+                <w:bCs/>
+              </w:rPr>
+              <w:t>Description</w:t>
+            </w:r>
+          </w:p>
+        </w:tc>
+      </w:tr>
+      <w:tr>
+        <w:tc>
+          <w:tcPr>
+            <w:tcW w:w="0" w:type="auto"/>
+          </w:tcPr>
+          <w:p>
+            <w:pPr>
+              <w:pStyle w:val="Compact"/>
+            </w:pPr>
+            <w:r>
+              <w:t>Gender</w:t>
+            </w:r>
+          </w:p>
+        </w:tc>
+        <w:tc>
+          <w:tcPr>
+            <w:tcW w:w="0" w:type="auto"/>
+          </w:tcPr>
+          <w:p>
+            <w:pPr>
+              <w:pStyle w:val="Compact"/>
+            </w:pPr>
+            <w:r>
+              <w:t>Customer Gender</w:t>
+            </w:r>
+          </w:p>
+        </w:tc>
+      </w:tr>
+      <w:tr>
+        <w:tc>
+          <w:tcPr>
+            <w:tcW w:w="0" w:type="auto"/>
+          </w:tcPr>
+          <w:p>
+            <w:pPr>
+              <w:pStyle w:val="Compact"/>
+            </w:pPr>
+            <w:proofErr w:type="spellStart"/>
+            <w:r>
+              <w:t>SeniorCitizen</w:t>
+            </w:r>
+            <w:proofErr w:type="spellEnd"/>
+          </w:p>
+        </w:tc>
+        <w:tc>
+          <w:tcPr>
+            <w:tcW w:w="0" w:type="auto"/>
+          </w:tcPr>
+          <w:p>
+            <w:pPr>
+              <w:pStyle w:val="Compact"/>
+            </w:pPr>
+            <w:r>
+              <w:t>Senior Citizen Status</w:t>
+            </w:r>
+          </w:p>
+        </w:tc>
+      </w:tr>
+      <w:tr>
+        <w:tc>
+          <w:tcPr>
+            <w:tcW w:w="0" w:type="auto"/>
+          </w:tcPr>
+          <w:p>
+            <w:pPr>
+              <w:pStyle w:val="Compact"/>
+            </w:pPr>
+            <w:r>
+              <w:t>Tenure</w:t>
+            </w:r>
+          </w:p>
+        </w:tc>
+        <w:tc>
+          <w:tcPr>
+            <w:tcW w:w="0" w:type="auto"/>
+          </w:tcPr>
+          <w:p>
+            <w:pPr>
+              <w:pStyle w:val="Compact"/>
+            </w:pPr>
+            <w:r>
+              <w:t>Number of Months with Company</w:t>
+            </w:r>
+          </w:p>
+        </w:tc>
+      </w:tr>
+      <w:tr>
+        <w:tc>
+          <w:tcPr>
+            <w:tcW w:w="0" w:type="auto"/>
+          </w:tcPr>
+          <w:p>
+            <w:pPr>
+              <w:pStyle w:val="Compact"/>
+            </w:pPr>
+            <w:proofErr w:type="spellStart"/>
+            <w:r>
+              <w:t>MonthlyCharges</w:t>
+            </w:r>
+            <w:proofErr w:type="spellEnd"/>
+          </w:p>
+        </w:tc>
+        <w:tc>
+          <w:tcPr>
+            <w:tcW w:w="0" w:type="auto"/>
+          </w:tcPr>
+          <w:p>
+            <w:pPr>
+              <w:pStyle w:val="Compact"/>
+            </w:pPr>
+            <w:r>
+              <w:t>Monthly Subscription Cost</w:t>
+            </w:r>
+          </w:p>
+        </w:tc>
+      </w:tr>
+      <w:tr>
+        <w:tc>
+          <w:tcPr>
+            <w:tcW w:w="0" w:type="auto"/>
+          </w:tcPr>
+          <w:p>
+            <w:pPr>
+              <w:pStyle w:val="Compact"/>
+            </w:pPr>
+            <w:proofErr w:type="spellStart"/>
+            <w:r>
+              <w:t>TotalCharges</w:t>
+            </w:r>
+            <w:proofErr w:type="spellEnd"/>
+          </w:p>
+        </w:tc>
+        <w:tc>
+          <w:tcPr>
+            <w:tcW w:w="0" w:type="auto"/>
+          </w:tcPr>
+          <w:p>
+            <w:pPr>
+              <w:pStyle w:val="Compact"/>
+            </w:pPr>
+            <w:r>
+              <w:t>Total Amount Billed</w:t>
+            </w:r>
+          </w:p>
+        </w:tc>
+      </w:tr>
+      <w:tr>
+        <w:tc>
+          <w:tcPr>
+            <w:tcW w:w="0" w:type="auto"/>
+          </w:tcPr>
+          <w:p>
+            <w:pPr>
+              <w:pStyle w:val="Compact"/>
+            </w:pPr>
+            <w:r>
+              <w:t>Contract</w:t>
+            </w:r>
+          </w:p>
+        </w:tc>
+        <w:tc>
+          <w:tcPr>
+            <w:tcW w:w="0" w:type="auto"/>
+          </w:tcPr>
+          <w:p>
+            <w:pPr>
+              <w:pStyle w:val="Compact"/>
+            </w:pPr>
+            <w:r>
+              <w:t>Contract Type</w:t>
+            </w:r>
+          </w:p>
+        </w:tc>
+      </w:tr>
+      <w:tr>
+        <w:tc>
+          <w:tcPr>
+            <w:tcW w:w="0" w:type="auto"/>
+          </w:tcPr>
+          <w:p>
+            <w:pPr>
+              <w:pStyle w:val="Compact"/>
+            </w:pPr>
+            <w:r>
+              <w:t>Churn</w:t>
+            </w:r>
+          </w:p>
+        </w:tc>
+        <w:tc>
+          <w:tcPr>
+            <w:tcW w:w="0" w:type="auto"/>
+          </w:tcPr>
+          <w:p>
+            <w:pPr>
+              <w:pStyle w:val="Compact"/>
+            </w:pPr>
+            <w:r>
+              <w:t>Target Variable</w:t>
+            </w:r>
+          </w:p>
+        </w:tc>
+      </w:tr>
+    </w:tbl>
+    <w:p>
+      <w:pPr>
+        <w:pStyle w:val="Compact"/>
+      </w:pPr>
+    </w:p>
+    <w:p>
+      <w:pPr>
+        <w:pStyle w:val="Compact"/>
+        <w:rPr>
+          <w:b/>
+          <w:bCs/>
+          <w:color w:val="EE0000"/>
+        </w:rPr>
+      </w:pPr>
+      <w:r>
+        <w:rPr>
+          <w:b/>
+          <w:bCs/>
+          <w:color w:val="EE0000"/>
+        </w:rPr>
+        <w:t>Deliverabl</w:t>
+      </w:r>
+      <w:r>
+        <w:rPr>
+          <w:b/>
+          <w:bCs/>
+          <w:color w:val="EE0000"/>
+        </w:rPr>
+        <w:t xml:space="preserve">e </w:t>
+      </w:r>
+      <w:proofErr w:type="gramStart"/>
+      <w:r>
+        <w:rPr>
+          <w:b/>
+          <w:bCs/>
+          <w:color w:val="EE0000"/>
+        </w:rPr>
+        <w:t>2</w:t>
+      </w:r>
+      <w:r>
+        <w:rPr>
+          <w:b/>
+          <w:bCs/>
+          <w:color w:val="EE0000"/>
+        </w:rPr>
+        <w:t xml:space="preserve"> :</w:t>
+      </w:r>
+      <w:proofErr w:type="gramEnd"/>
+      <w:r>
+        <w:rPr>
+          <w:b/>
+          <w:bCs/>
+          <w:color w:val="EE0000"/>
+        </w:rPr>
+        <w:t xml:space="preserve"> Data Understanding Report</w:t>
+      </w:r>
+    </w:p>
+    <w:bookmarkEnd w:id="2"/>
+    <w:p/>
+    <w:p>
+      <w:pPr>
+        <w:pStyle w:val="Compact"/>
+        <w:ind w:left="360"/>
+      </w:pPr>
+      <w:r>
+        <w:t xml:space="preserve">I already loaded dataset using </w:t>
+      </w:r>
+      <w:proofErr w:type="spellStart"/>
+      <w:r>
+        <w:t>df</w:t>
+      </w:r>
+      <w:proofErr w:type="spellEnd"/>
+      <w:r>
+        <w:t xml:space="preserve"> = </w:t>
+      </w:r>
+      <w:proofErr w:type="spellStart"/>
+      <w:proofErr w:type="gramStart"/>
+      <w:r>
+        <w:t>pd.read</w:t>
+      </w:r>
+      <w:proofErr w:type="gramEnd"/>
+      <w:r>
+        <w:t>_csv</w:t>
+      </w:r>
+      <w:proofErr w:type="spellEnd"/>
+      <w:r>
+        <w:t>('../data/telco_customer_churn.csv')</w:t>
+      </w:r>
+      <w:r>
+        <w:t xml:space="preserve"> &amp; </w:t>
+      </w:r>
+      <w:proofErr w:type="spellStart"/>
+      <w:proofErr w:type="gramStart"/>
+      <w:r>
+        <w:t>df.head</w:t>
+      </w:r>
+      <w:proofErr w:type="spellEnd"/>
+      <w:proofErr w:type="gramEnd"/>
+      <w:r>
+        <w:t>().</w:t>
+      </w:r>
+    </w:p>
+    <w:p>
+      <w:pPr>
+        <w:pStyle w:val="Compact"/>
+        <w:ind w:left="360"/>
+      </w:pPr>
+      <w:r>
+        <w:t xml:space="preserve">Now give me the code </w:t>
+      </w:r>
+      <w:proofErr w:type="gramStart"/>
+      <w:r>
+        <w:t>to:-</w:t>
+      </w:r>
+      <w:proofErr w:type="gramEnd"/>
+    </w:p>
+    <w:p>
+      <w:pPr>
+        <w:pStyle w:val="Compact"/>
+        <w:numPr>
+          <w:ilvl w:val="0"/>
+          <w:numId w:val="3"/>
+        </w:numPr>
+      </w:pPr>
+      <w:r>
+        <w:t xml:space="preserve"> </w:t>
+      </w:r>
+      <w:r>
+        <w:t>Review dataset structure.</w:t>
+      </w:r>
+    </w:p>
+    <w:p>
+      <w:pPr>
+        <w:pStyle w:val="Compact"/>
+        <w:numPr>
+          <w:ilvl w:val="0"/>
+          <w:numId w:val="3"/>
+        </w:numPr>
+      </w:pPr>
+      <w:r>
+        <w:t>Understand feature definitions.</w:t>
+      </w:r>
+    </w:p>
+    <w:p>
+      <w:pPr>
+        <w:pStyle w:val="Compact"/>
+        <w:numPr>
+          <w:ilvl w:val="0"/>
+          <w:numId w:val="3"/>
+        </w:numPr>
+      </w:pPr>
+      <w:r>
+        <w:t>Identify target variable.</w:t>
+      </w:r>
+    </w:p>
+    <w:p>
+      <w:pPr>
+        <w:pStyle w:val="Compact"/>
+        <w:numPr>
+          <w:ilvl w:val="0"/>
+          <w:numId w:val="3"/>
+        </w:numPr>
+      </w:pPr>
+      <w:r>
+        <w:t>Detect missing values.</w:t>
+      </w:r>
+    </w:p>
+    <w:p>
+      <w:pPr>
+        <w:pStyle w:val="Compact"/>
+        <w:numPr>
+          <w:ilvl w:val="0"/>
+          <w:numId w:val="3"/>
+        </w:numPr>
+      </w:pPr>
+      <w:r>
+        <w:t>Analyze data types.</w:t>
+      </w:r>
+    </w:p>
+    <w:p>
+      <w:pPr>
+        <w:pStyle w:val="Compact"/>
+      </w:pPr>
+    </w:p>
+    <w:p>
+      <w:pPr>
+        <w:pStyle w:val="Compact"/>
+      </w:pPr>
+    </w:p>
     <w:p/>
     <w:sectPr>
       <w:pgSz w:w="11906" w:h="16838"/>
@@ -11,6 +1177,412 @@
     </w:sectPr>
   </w:body>
 </w:document>
+</file>
+
+<file path=word/numbering.xml><?xml version="1.0" encoding="utf-8"?>
+<w:numbering xmlns:wpc="http://schemas.microsoft.com/office/word/2010/wordprocessingCanvas" xmlns:cx="http://schemas.microsoft.com/office/drawing/2014/chartex" xmlns:cx1="http://schemas.microsoft.com/office/drawing/2015/9/8/chartex" xmlns:cx2="http://schemas.microsoft.com/office/drawing/2015/10/21/chartex" xmlns:cx3="http://schemas.microsoft.com/office/drawing/2016/5/9/chartex" xmlns:cx4="http://schemas.microsoft.com/office/drawing/2016/5/10/chartex" xmlns:cx5="http://schemas.microsoft.com/office/drawing/2016/5/11/chartex" xmlns:cx6="http://schemas.microsoft.com/office/drawing/2016/5/12/chartex" xmlns:cx7="http://schemas.microsoft.com/office/drawing/2016/5/13/chartex" xmlns:cx8="http://schemas.microsoft.com/office/drawing/2016/5/14/chartex" xmlns:mc="http://schemas.openxmlformats.org/markup-compatibility/2006" xmlns:aink="http://schemas.microsoft.com/office/drawing/2016/ink" xmlns:am3d="http://schemas.microsoft.com/office/drawing/2017/model3d" xmlns:o="urn:schemas-microsoft-com:office:office" xmlns:oel="http://schemas.microsoft.com/office/2019/extlst" xmlns:r="http://schemas.openxmlformats.org/officeDocument/2006/relationships" xmlns:m="http://schemas.openxmlformats.org/officeDocument/2006/math" xmlns:v="urn:schemas-microsoft-com:vml" xmlns:wp14="http://schemas.microsoft.com/office/word/2010/wordprocessingDrawing" xmlns:wp="http://schemas.openxmlformats.org/drawingml/2006/wordprocessingDrawing" xmlns:w10="urn:schemas-microsoft-com:office:word" xmlns:w="http://schemas.openxmlformats.org/wordprocessingml/2006/main" xmlns:w14="http://schemas.microsoft.com/office/word/2010/wordml" xmlns:w15="http://schemas.microsoft.com/office/word/2012/wordml" xmlns:w16cex="http://schemas.microsoft.com/office/word/2018/wordml/cex" xmlns:w16cid="http://schemas.microsoft.com/office/word/2016/wordml/cid" xmlns:w16="http://schemas.microsoft.com/office/word/2018/wordml" xmlns:w16du="http://schemas.microsoft.com/office/word/2023/wordml/word16du" xmlns:w16sdtdh="http://schemas.microsoft.com/office/word/2020/wordml/sdtdatahash" xmlns:w16sdtfl="http://schemas.microsoft.com/office/word/2024/wordml/sdtformatlock" xmlns:w16se="http://schemas.microsoft.com/office/word/2015/wordml/symex" xmlns:wpg="http://schemas.microsoft.com/office/word/2010/wordprocessingGroup" xmlns:wpi="http://schemas.microsoft.com/office/word/2010/wordprocessingInk" xmlns:wne="http://schemas.microsoft.com/office/word/2006/wordml" xmlns:wps="http://schemas.microsoft.com/office/word/2010/wordprocessingShape" mc:Ignorable="w14 w15 w16se w16cid w16 w16cex w16sdtdh w16sdtfl w16du wp14">
+  <w:abstractNum w:abstractNumId="0" w15:restartNumberingAfterBreak="0">
+    <w:nsid w:val="0000A991"/>
+    <w:multiLevelType w:val="multilevel"/>
+    <w:tmpl w:val="305A74A4"/>
+    <w:lvl w:ilvl="0">
+      <w:numFmt w:val="bullet"/>
+      <w:lvlText w:val=""/>
+      <w:lvlJc w:val="left"/>
+      <w:pPr>
+        <w:ind w:left="720" w:hanging="360"/>
+      </w:pPr>
+      <w:rPr>
+        <w:rFonts w:ascii="Symbol" w:hAnsi="Symbol" w:cs="Symbol" w:hint="default"/>
+      </w:rPr>
+    </w:lvl>
+    <w:lvl w:ilvl="1">
+      <w:numFmt w:val="bullet"/>
+      <w:lvlText w:val="o"/>
+      <w:lvlJc w:val="left"/>
+      <w:pPr>
+        <w:ind w:left="1440" w:hanging="360"/>
+      </w:pPr>
+      <w:rPr>
+        <w:rFonts w:ascii="Courier New" w:hAnsi="Courier New" w:cs="Courier New" w:hint="default"/>
+      </w:rPr>
+    </w:lvl>
+    <w:lvl w:ilvl="2">
+      <w:numFmt w:val="bullet"/>
+      <w:lvlText w:val=""/>
+      <w:lvlJc w:val="left"/>
+      <w:pPr>
+        <w:ind w:left="2160" w:hanging="360"/>
+      </w:pPr>
+      <w:rPr>
+        <w:rFonts w:ascii="Wingdings" w:hAnsi="Wingdings" w:cs="Wingdings" w:hint="default"/>
+      </w:rPr>
+    </w:lvl>
+    <w:lvl w:ilvl="3">
+      <w:numFmt w:val="bullet"/>
+      <w:lvlText w:val=""/>
+      <w:lvlJc w:val="left"/>
+      <w:pPr>
+        <w:ind w:left="2880" w:hanging="360"/>
+      </w:pPr>
+      <w:rPr>
+        <w:rFonts w:ascii="Symbol" w:hAnsi="Symbol" w:cs="Symbol" w:hint="default"/>
+      </w:rPr>
+    </w:lvl>
+    <w:lvl w:ilvl="4">
+      <w:numFmt w:val="bullet"/>
+      <w:lvlText w:val="o"/>
+      <w:lvlJc w:val="left"/>
+      <w:pPr>
+        <w:ind w:left="3600" w:hanging="360"/>
+      </w:pPr>
+      <w:rPr>
+        <w:rFonts w:ascii="Courier New" w:hAnsi="Courier New" w:cs="Courier New" w:hint="default"/>
+      </w:rPr>
+    </w:lvl>
+    <w:lvl w:ilvl="5">
+      <w:numFmt w:val="bullet"/>
+      <w:lvlText w:val=""/>
+      <w:lvlJc w:val="left"/>
+      <w:pPr>
+        <w:ind w:left="4320" w:hanging="360"/>
+      </w:pPr>
+      <w:rPr>
+        <w:rFonts w:ascii="Wingdings" w:hAnsi="Wingdings" w:cs="Wingdings" w:hint="default"/>
+      </w:rPr>
+    </w:lvl>
+    <w:lvl w:ilvl="6">
+      <w:numFmt w:val="bullet"/>
+      <w:lvlText w:val=""/>
+      <w:lvlJc w:val="left"/>
+      <w:pPr>
+        <w:ind w:left="5040" w:hanging="360"/>
+      </w:pPr>
+      <w:rPr>
+        <w:rFonts w:ascii="Symbol" w:hAnsi="Symbol" w:cs="Symbol" w:hint="default"/>
+      </w:rPr>
+    </w:lvl>
+    <w:lvl w:ilvl="7">
+      <w:numFmt w:val="bullet"/>
+      <w:lvlText w:val="o"/>
+      <w:lvlJc w:val="left"/>
+      <w:pPr>
+        <w:ind w:left="5760" w:hanging="360"/>
+      </w:pPr>
+      <w:rPr>
+        <w:rFonts w:ascii="Courier New" w:hAnsi="Courier New" w:cs="Courier New" w:hint="default"/>
+      </w:rPr>
+    </w:lvl>
+    <w:lvl w:ilvl="8">
+      <w:numFmt w:val="bullet"/>
+      <w:lvlText w:val=""/>
+      <w:lvlJc w:val="left"/>
+      <w:pPr>
+        <w:ind w:left="6480" w:hanging="360"/>
+      </w:pPr>
+      <w:rPr>
+        <w:rFonts w:ascii="Wingdings" w:hAnsi="Wingdings" w:cs="Wingdings" w:hint="default"/>
+      </w:rPr>
+    </w:lvl>
+  </w:abstractNum>
+  <w:abstractNum w:abstractNumId="1" w15:restartNumberingAfterBreak="0">
+    <w:nsid w:val="00A99411"/>
+    <w:multiLevelType w:val="multilevel"/>
+    <w:tmpl w:val="87206CC4"/>
+    <w:lvl w:ilvl="0">
+      <w:start w:val="1"/>
+      <w:numFmt w:val="decimal"/>
+      <w:lvlText w:val="%1."/>
+      <w:lvlJc w:val="left"/>
+      <w:pPr>
+        <w:ind w:left="720" w:hanging="360"/>
+      </w:pPr>
+    </w:lvl>
+    <w:lvl w:ilvl="1">
+      <w:start w:val="1"/>
+      <w:numFmt w:val="decimal"/>
+      <w:lvlText w:val="%2."/>
+      <w:lvlJc w:val="left"/>
+      <w:pPr>
+        <w:ind w:left="1440" w:hanging="360"/>
+      </w:pPr>
+    </w:lvl>
+    <w:lvl w:ilvl="2">
+      <w:start w:val="1"/>
+      <w:numFmt w:val="decimal"/>
+      <w:lvlText w:val="%3."/>
+      <w:lvlJc w:val="left"/>
+      <w:pPr>
+        <w:ind w:left="2160" w:hanging="360"/>
+      </w:pPr>
+    </w:lvl>
+    <w:lvl w:ilvl="3">
+      <w:start w:val="1"/>
+      <w:numFmt w:val="decimal"/>
+      <w:lvlText w:val="%4."/>
+      <w:lvlJc w:val="left"/>
+      <w:pPr>
+        <w:ind w:left="2880" w:hanging="360"/>
+      </w:pPr>
+    </w:lvl>
+    <w:lvl w:ilvl="4">
+      <w:start w:val="1"/>
+      <w:numFmt w:val="decimal"/>
+      <w:lvlText w:val="%5."/>
+      <w:lvlJc w:val="left"/>
+      <w:pPr>
+        <w:ind w:left="3600" w:hanging="360"/>
+      </w:pPr>
+    </w:lvl>
+    <w:lvl w:ilvl="5">
+      <w:start w:val="1"/>
+      <w:numFmt w:val="decimal"/>
+      <w:lvlText w:val="%6."/>
+      <w:lvlJc w:val="left"/>
+      <w:pPr>
+        <w:ind w:left="4320" w:hanging="360"/>
+      </w:pPr>
+    </w:lvl>
+    <w:lvl w:ilvl="6">
+      <w:start w:val="1"/>
+      <w:numFmt w:val="decimal"/>
+      <w:lvlText w:val="%7."/>
+      <w:lvlJc w:val="left"/>
+      <w:pPr>
+        <w:ind w:left="5040" w:hanging="360"/>
+      </w:pPr>
+    </w:lvl>
+    <w:lvl w:ilvl="7">
+      <w:start w:val="1"/>
+      <w:numFmt w:val="decimal"/>
+      <w:lvlText w:val="%8."/>
+      <w:lvlJc w:val="left"/>
+      <w:pPr>
+        <w:ind w:left="5760" w:hanging="360"/>
+      </w:pPr>
+    </w:lvl>
+    <w:lvl w:ilvl="8">
+      <w:start w:val="1"/>
+      <w:numFmt w:val="decimal"/>
+      <w:lvlText w:val="%9."/>
+      <w:lvlJc w:val="left"/>
+      <w:pPr>
+        <w:ind w:left="6480" w:hanging="360"/>
+      </w:pPr>
+    </w:lvl>
+  </w:abstractNum>
+  <w:abstractNum w:abstractNumId="2" w15:restartNumberingAfterBreak="0">
+    <w:nsid w:val="0EEF1468"/>
+    <w:multiLevelType w:val="multilevel"/>
+    <w:tmpl w:val="87206CC4"/>
+    <w:lvl w:ilvl="0">
+      <w:start w:val="1"/>
+      <w:numFmt w:val="decimal"/>
+      <w:lvlText w:val="%1."/>
+      <w:lvlJc w:val="left"/>
+      <w:pPr>
+        <w:ind w:left="720" w:hanging="360"/>
+      </w:pPr>
+    </w:lvl>
+    <w:lvl w:ilvl="1">
+      <w:start w:val="1"/>
+      <w:numFmt w:val="decimal"/>
+      <w:lvlText w:val="%2."/>
+      <w:lvlJc w:val="left"/>
+      <w:pPr>
+        <w:ind w:left="1440" w:hanging="360"/>
+      </w:pPr>
+    </w:lvl>
+    <w:lvl w:ilvl="2">
+      <w:start w:val="1"/>
+      <w:numFmt w:val="decimal"/>
+      <w:lvlText w:val="%3."/>
+      <w:lvlJc w:val="left"/>
+      <w:pPr>
+        <w:ind w:left="2160" w:hanging="360"/>
+      </w:pPr>
+    </w:lvl>
+    <w:lvl w:ilvl="3">
+      <w:start w:val="1"/>
+      <w:numFmt w:val="decimal"/>
+      <w:lvlText w:val="%4."/>
+      <w:lvlJc w:val="left"/>
+      <w:pPr>
+        <w:ind w:left="2880" w:hanging="360"/>
+      </w:pPr>
+    </w:lvl>
+    <w:lvl w:ilvl="4">
+      <w:start w:val="1"/>
+      <w:numFmt w:val="decimal"/>
+      <w:lvlText w:val="%5."/>
+      <w:lvlJc w:val="left"/>
+      <w:pPr>
+        <w:ind w:left="3600" w:hanging="360"/>
+      </w:pPr>
+    </w:lvl>
+    <w:lvl w:ilvl="5">
+      <w:start w:val="1"/>
+      <w:numFmt w:val="decimal"/>
+      <w:lvlText w:val="%6."/>
+      <w:lvlJc w:val="left"/>
+      <w:pPr>
+        <w:ind w:left="4320" w:hanging="360"/>
+      </w:pPr>
+    </w:lvl>
+    <w:lvl w:ilvl="6">
+      <w:start w:val="1"/>
+      <w:numFmt w:val="decimal"/>
+      <w:lvlText w:val="%7."/>
+      <w:lvlJc w:val="left"/>
+      <w:pPr>
+        <w:ind w:left="5040" w:hanging="360"/>
+      </w:pPr>
+    </w:lvl>
+    <w:lvl w:ilvl="7">
+      <w:start w:val="1"/>
+      <w:numFmt w:val="decimal"/>
+      <w:lvlText w:val="%8."/>
+      <w:lvlJc w:val="left"/>
+      <w:pPr>
+        <w:ind w:left="5760" w:hanging="360"/>
+      </w:pPr>
+    </w:lvl>
+    <w:lvl w:ilvl="8">
+      <w:start w:val="1"/>
+      <w:numFmt w:val="decimal"/>
+      <w:lvlText w:val="%9."/>
+      <w:lvlJc w:val="left"/>
+      <w:pPr>
+        <w:ind w:left="6480" w:hanging="360"/>
+      </w:pPr>
+    </w:lvl>
+  </w:abstractNum>
+  <w:abstractNum w:abstractNumId="3" w15:restartNumberingAfterBreak="0">
+    <w:nsid w:val="57F80CE2"/>
+    <w:multiLevelType w:val="multilevel"/>
+    <w:tmpl w:val="87206CC4"/>
+    <w:lvl w:ilvl="0">
+      <w:start w:val="1"/>
+      <w:numFmt w:val="decimal"/>
+      <w:lvlText w:val="%1."/>
+      <w:lvlJc w:val="left"/>
+      <w:pPr>
+        <w:ind w:left="720" w:hanging="360"/>
+      </w:pPr>
+    </w:lvl>
+    <w:lvl w:ilvl="1">
+      <w:start w:val="1"/>
+      <w:numFmt w:val="decimal"/>
+      <w:lvlText w:val="%2."/>
+      <w:lvlJc w:val="left"/>
+      <w:pPr>
+        <w:ind w:left="1440" w:hanging="360"/>
+      </w:pPr>
+    </w:lvl>
+    <w:lvl w:ilvl="2">
+      <w:start w:val="1"/>
+      <w:numFmt w:val="decimal"/>
+      <w:lvlText w:val="%3."/>
+      <w:lvlJc w:val="left"/>
+      <w:pPr>
+        <w:ind w:left="2160" w:hanging="360"/>
+      </w:pPr>
+    </w:lvl>
+    <w:lvl w:ilvl="3">
+      <w:start w:val="1"/>
+      <w:numFmt w:val="decimal"/>
+      <w:lvlText w:val="%4."/>
+      <w:lvlJc w:val="left"/>
+      <w:pPr>
+        <w:ind w:left="2880" w:hanging="360"/>
+      </w:pPr>
+    </w:lvl>
+    <w:lvl w:ilvl="4">
+      <w:start w:val="1"/>
+      <w:numFmt w:val="decimal"/>
+      <w:lvlText w:val="%5."/>
+      <w:lvlJc w:val="left"/>
+      <w:pPr>
+        <w:ind w:left="3600" w:hanging="360"/>
+      </w:pPr>
+    </w:lvl>
+    <w:lvl w:ilvl="5">
+      <w:start w:val="1"/>
+      <w:numFmt w:val="decimal"/>
+      <w:lvlText w:val="%6."/>
+      <w:lvlJc w:val="left"/>
+      <w:pPr>
+        <w:ind w:left="4320" w:hanging="360"/>
+      </w:pPr>
+    </w:lvl>
+    <w:lvl w:ilvl="6">
+      <w:start w:val="1"/>
+      <w:numFmt w:val="decimal"/>
+      <w:lvlText w:val="%7."/>
+      <w:lvlJc w:val="left"/>
+      <w:pPr>
+        <w:ind w:left="5040" w:hanging="360"/>
+      </w:pPr>
+    </w:lvl>
+    <w:lvl w:ilvl="7">
+      <w:start w:val="1"/>
+      <w:numFmt w:val="decimal"/>
+      <w:lvlText w:val="%8."/>
+      <w:lvlJc w:val="left"/>
+      <w:pPr>
+        <w:ind w:left="5760" w:hanging="360"/>
+      </w:pPr>
+    </w:lvl>
+    <w:lvl w:ilvl="8">
+      <w:start w:val="1"/>
+      <w:numFmt w:val="decimal"/>
+      <w:lvlText w:val="%9."/>
+      <w:lvlJc w:val="left"/>
+      <w:pPr>
+        <w:ind w:left="6480" w:hanging="360"/>
+      </w:pPr>
+    </w:lvl>
+  </w:abstractNum>
+  <w:num w:numId="1" w16cid:durableId="1475826811">
+    <w:abstractNumId w:val="0"/>
+  </w:num>
+  <w:num w:numId="2" w16cid:durableId="1107189838">
+    <w:abstractNumId w:val="1"/>
+    <w:lvlOverride w:ilvl="0">
+      <w:startOverride w:val="1"/>
+    </w:lvlOverride>
+    <w:lvlOverride w:ilvl="1">
+      <w:startOverride w:val="1"/>
+    </w:lvlOverride>
+    <w:lvlOverride w:ilvl="2">
+      <w:startOverride w:val="1"/>
+    </w:lvlOverride>
+    <w:lvlOverride w:ilvl="3">
+      <w:startOverride w:val="1"/>
+    </w:lvlOverride>
+    <w:lvlOverride w:ilvl="4">
+      <w:startOverride w:val="1"/>
+    </w:lvlOverride>
+    <w:lvlOverride w:ilvl="5">
+      <w:startOverride w:val="1"/>
+    </w:lvlOverride>
+    <w:lvlOverride w:ilvl="6">
+      <w:startOverride w:val="1"/>
+    </w:lvlOverride>
+    <w:lvlOverride w:ilvl="7">
+      <w:startOverride w:val="1"/>
+    </w:lvlOverride>
+    <w:lvlOverride w:ilvl="8">
+      <w:startOverride w:val="1"/>
+    </w:lvlOverride>
+  </w:num>
+  <w:num w:numId="3" w16cid:durableId="1535313220">
+    <w:abstractNumId w:val="3"/>
+  </w:num>
+  <w:num w:numId="4" w16cid:durableId="2108579315">
+    <w:abstractNumId w:val="2"/>
+  </w:num>
+</w:numbering>
 </file>
 
 <file path=word/styles.xml><?xml version="1.0" encoding="utf-8"?>
@@ -930,6 +2502,74 @@
       <w:spacing w:val="5"/>
     </w:rPr>
   </w:style>
+  <w:style w:type="paragraph" w:customStyle="1" w:styleId="Compact">
+    <w:name w:val="Compact"/>
+    <w:basedOn w:val="BodyText"/>
+    <w:qFormat/>
+    <w:rsid w:val="00E57A23"/>
+    <w:pPr>
+      <w:spacing w:before="36" w:after="36" w:line="240" w:lineRule="auto"/>
+    </w:pPr>
+    <w:rPr>
+      <w:kern w:val="0"/>
+      <w:lang w:val="en-US"/>
+      <w14:ligatures w14:val="none"/>
+    </w:rPr>
+  </w:style>
+  <w:style w:type="paragraph" w:styleId="BodyText">
+    <w:name w:val="Body Text"/>
+    <w:basedOn w:val="Normal"/>
+    <w:link w:val="BodyTextChar"/>
+    <w:uiPriority w:val="99"/>
+    <w:semiHidden/>
+    <w:unhideWhenUsed/>
+    <w:rsid w:val="00E57A23"/>
+    <w:pPr>
+      <w:spacing w:after="120"/>
+    </w:pPr>
+  </w:style>
+  <w:style w:type="character" w:customStyle="1" w:styleId="BodyTextChar">
+    <w:name w:val="Body Text Char"/>
+    <w:basedOn w:val="DefaultParagraphFont"/>
+    <w:link w:val="BodyText"/>
+    <w:uiPriority w:val="99"/>
+    <w:semiHidden/>
+    <w:rsid w:val="00E57A23"/>
+  </w:style>
+  <w:style w:type="paragraph" w:customStyle="1" w:styleId="FirstParagraph">
+    <w:name w:val="First Paragraph"/>
+    <w:basedOn w:val="BodyText"/>
+    <w:next w:val="BodyText"/>
+    <w:qFormat/>
+    <w:rsid w:val="00E57A23"/>
+    <w:pPr>
+      <w:spacing w:before="180" w:after="180" w:line="240" w:lineRule="auto"/>
+    </w:pPr>
+    <w:rPr>
+      <w:kern w:val="0"/>
+      <w:lang w:val="en-US"/>
+      <w14:ligatures w14:val="none"/>
+    </w:rPr>
+  </w:style>
+  <w:style w:type="table" w:styleId="TableGrid">
+    <w:name w:val="Table Grid"/>
+    <w:basedOn w:val="TableNormal"/>
+    <w:uiPriority w:val="39"/>
+    <w:rsid w:val="00E57A23"/>
+    <w:pPr>
+      <w:spacing w:after="0" w:line="240" w:lineRule="auto"/>
+    </w:pPr>
+    <w:tblPr>
+      <w:tblBorders>
+        <w:top w:val="single" w:sz="4" w:space="0" w:color="auto"/>
+        <w:left w:val="single" w:sz="4" w:space="0" w:color="auto"/>
+        <w:bottom w:val="single" w:sz="4" w:space="0" w:color="auto"/>
+        <w:right w:val="single" w:sz="4" w:space="0" w:color="auto"/>
+        <w:insideH w:val="single" w:sz="4" w:space="0" w:color="auto"/>
+        <w:insideV w:val="single" w:sz="4" w:space="0" w:color="auto"/>
+      </w:tblBorders>
+    </w:tblPr>
+  </w:style>
 </w:styles>
 </file>
 

</xml_diff>